<commit_message>
Add one-page AI Engineer CV and correct FactoryBrain retrieval claim
The AI Engineer CV leads with the Python RAG, LLM automation and agent
work, with an evidence report that separates implemented technologies
from explored ones. The BIAI CV said FactoryBrain answers with a BM25
hybrid scorer; Ask now goes through the Python Qdrant + Gemini service,
so that bullet and its evidence row are corrected.

Co-Authored-By: Claude Opus 5.5 <noreply@anthropic.com>
Claude-Session: https://claude.ai/code/session_01Xqyy8pAzWFuWFAkL6dctZp
</commit_message>
<xml_diff>
--- a/cv/Md_Shamiul_Islam_Riyad_BIAI_Applied_AI_Intern_CV.docx
+++ b/cv/Md_Shamiul_Islam_Riyad_BIAI_Applied_AI_Intern_CV.docx
@@ -294,7 +294,7 @@
           <w:color w:val="444444"/>
           <w:sz w:val="19"/>
         </w:rPr>
-        <w:t>ASP.NET Core 9, Next.js, PostgreSQL + pgvector; OpenAI, Anthropic or Gemini; 174 xUnit and 57 Playwright tests. Personal project.</w:t>
+        <w:t>Python, FastAPI, Qdrant, ASP.NET Core 9, Next.js; OpenAI, Anthropic or Gemini; 174 xUnit and 57 Playwright tests. Personal project.</w:t>
       </w:r>
     </w:p>
     <w:p>
@@ -304,7 +304,7 @@
         <w:ind w:left="255"/>
       </w:pPr>
       <w:r>
-        <w:t>Built cited Q&amp;A over factory manuals with hybrid retrieval: vector search plus BM25 with a Bangla-aware tokenizer.</w:t>
+        <w:t>Built cited Q&amp;A over factory manuals through a Python RAG service that answers from retrieved chunks only.</w:t>
       </w:r>
     </w:p>
     <w:p>
@@ -595,7 +595,7 @@
         <w:t>AI and LLMs:</w:t>
       </w:r>
       <w:r>
-        <w:t xml:space="preserve"> Gemini and Claude APIs, prompt design, RAG (chunking, embeddings, hybrid retrieval), LangChain, Qdrant, pgvector</w:t>
+        <w:t xml:space="preserve"> Gemini and Claude APIs, prompt design, RAG (chunking, embeddings, retrieval, citations), LangChain, Qdrant</w:t>
       </w:r>
     </w:p>
     <w:p>

</xml_diff>